<commit_message>
Minor updates to test data
</commit_message>
<xml_diff>
--- a/test-data/document.docx
+++ b/test-data/document.docx
@@ -35,7 +35,15 @@
       </w:pPr>
       <w:r>
         <w:rPr/>
-        <w:t>BEGIN-1</w:t>
+        <w:t>{{</w:t>
+      </w:r>
+      <w:r>
+        <w:rPr/>
+        <w:t xml:space="preserve">Name of system: </w:t>
+      </w:r>
+      <w:r>
+        <w:rPr/>
+        <w:t>|| }}</w:t>
       </w:r>
     </w:p>
     <w:p>
@@ -47,7 +55,6 @@
       </w:pPr>
       <w:r>
         <w:rPr/>
-        <w:t>Name of system</w:t>
       </w:r>
     </w:p>
     <w:p>
@@ -59,31 +66,23 @@
       </w:pPr>
       <w:r>
         <w:rPr/>
-        <w:t>ANSWER-1</w:t>
-      </w:r>
-    </w:p>
-    <w:p>
-      <w:pPr>
-        <w:pStyle w:val="BodyText"/>
-        <w:bidi w:val="0"/>
-        <w:jc w:val="start"/>
-        <w:rPr/>
-      </w:pPr>
-      <w:r>
-        <w:rPr/>
-        <w:t>END-1</w:t>
-      </w:r>
-    </w:p>
-    <w:p>
-      <w:pPr>
-        <w:pStyle w:val="BodyText"/>
-        <w:bidi w:val="0"/>
-        <w:jc w:val="start"/>
-        <w:rPr/>
-      </w:pPr>
-      <w:r>
-        <w:rPr/>
-        <w:t>BEGIN-1 License: ANSWER-1 END-1</w:t>
+        <w:t>{{</w:t>
+      </w:r>
+      <w:r>
+        <w:rPr/>
+        <w:t xml:space="preserve"> License: </w:t>
+      </w:r>
+      <w:r>
+        <w:rPr/>
+        <w:t>||</w:t>
+      </w:r>
+      <w:r>
+        <w:rPr/>
+        <w:t xml:space="preserve"> END-1 </w:t>
+      </w:r>
+      <w:r>
+        <w:rPr/>
+        <w:t>}}</w:t>
       </w:r>
     </w:p>
     <w:p>
@@ -92,6 +91,51 @@
         <w:bidi w:val="0"/>
         <w:spacing w:before="0" w:after="140"/>
         <w:jc w:val="start"/>
+        <w:rPr/>
+      </w:pPr>
+      <w:r>
+        <w:rPr/>
+      </w:r>
+    </w:p>
+    <w:p>
+      <w:pPr>
+        <w:pStyle w:val="Heading2"/>
+        <w:ind w:hanging="0" w:start="0"/>
+        <w:rPr/>
+      </w:pPr>
+      <w:r>
+        <w:rPr/>
+        <w:t>{{</w:t>
+      </w:r>
+      <w:r>
+        <w:rPr/>
+        <w:t>System description</w:t>
+      </w:r>
+    </w:p>
+    <w:p>
+      <w:pPr>
+        <w:pStyle w:val="BodyText"/>
+        <w:rPr/>
+      </w:pPr>
+      <w:r>
+        <w:rPr/>
+        <w:t>Describe the system from a non-technical point of view.</w:t>
+      </w:r>
+    </w:p>
+    <w:p>
+      <w:pPr>
+        <w:pStyle w:val="BodyText"/>
+        <w:rPr/>
+      </w:pPr>
+      <w:r>
+        <w:rPr/>
+        <w:t>|| For example, consider users, user interface, installation, etc.}}</w:t>
+      </w:r>
+    </w:p>
+    <w:p>
+      <w:pPr>
+        <w:pStyle w:val="BodyText"/>
+        <w:spacing w:before="0" w:after="140"/>
         <w:rPr/>
       </w:pPr>
       <w:r>
@@ -105,9 +149,138 @@
       <w:pgNumType w:fmt="decimal"/>
       <w:formProt w:val="false"/>
       <w:textDirection w:val="lrTb"/>
+      <w:docGrid w:type="default" w:linePitch="100" w:charSpace="0"/>
     </w:sectPr>
   </w:body>
 </w:document>
+</file>
+
+<file path=word/numbering.xml><?xml version="1.0" encoding="utf-8"?>
+<w:numbering xmlns:w="http://schemas.openxmlformats.org/wordprocessingml/2006/main" xmlns:o="urn:schemas-microsoft-com:office:office" xmlns:r="http://schemas.openxmlformats.org/officeDocument/2006/relationships" xmlns:v="urn:schemas-microsoft-com:vml" xmlns:mc="http://schemas.openxmlformats.org/markup-compatibility/2006" xmlns:w14="http://schemas.microsoft.com/office/word/2010/wordml" mc:Ignorable="w14">
+  <w:abstractNum w:abstractNumId="1">
+    <w:lvl w:ilvl="0">
+      <w:start w:val="1"/>
+      <w:numFmt w:val="none"/>
+      <w:suff w:val="nothing"/>
+      <w:lvlText w:val=""/>
+      <w:lvlJc w:val="start"/>
+      <w:pPr>
+        <w:tabs>
+          <w:tab w:val="num" w:pos="0"/>
+        </w:tabs>
+        <w:ind w:start="0" w:hanging="0"/>
+      </w:pPr>
+    </w:lvl>
+    <w:lvl w:ilvl="1">
+      <w:start w:val="1"/>
+      <w:pStyle w:val="Heading2"/>
+      <w:numFmt w:val="none"/>
+      <w:suff w:val="nothing"/>
+      <w:lvlText w:val=""/>
+      <w:lvlJc w:val="start"/>
+      <w:pPr>
+        <w:tabs>
+          <w:tab w:val="num" w:pos="0"/>
+        </w:tabs>
+        <w:ind w:start="0" w:hanging="0"/>
+      </w:pPr>
+    </w:lvl>
+    <w:lvl w:ilvl="2">
+      <w:start w:val="1"/>
+      <w:numFmt w:val="none"/>
+      <w:suff w:val="nothing"/>
+      <w:lvlText w:val=""/>
+      <w:lvlJc w:val="start"/>
+      <w:pPr>
+        <w:tabs>
+          <w:tab w:val="num" w:pos="0"/>
+        </w:tabs>
+        <w:ind w:start="0" w:hanging="0"/>
+      </w:pPr>
+    </w:lvl>
+    <w:lvl w:ilvl="3">
+      <w:start w:val="1"/>
+      <w:numFmt w:val="none"/>
+      <w:suff w:val="nothing"/>
+      <w:lvlText w:val=""/>
+      <w:lvlJc w:val="start"/>
+      <w:pPr>
+        <w:tabs>
+          <w:tab w:val="num" w:pos="0"/>
+        </w:tabs>
+        <w:ind w:start="0" w:hanging="0"/>
+      </w:pPr>
+    </w:lvl>
+    <w:lvl w:ilvl="4">
+      <w:start w:val="1"/>
+      <w:numFmt w:val="none"/>
+      <w:suff w:val="nothing"/>
+      <w:lvlText w:val=""/>
+      <w:lvlJc w:val="start"/>
+      <w:pPr>
+        <w:tabs>
+          <w:tab w:val="num" w:pos="0"/>
+        </w:tabs>
+        <w:ind w:start="0" w:hanging="0"/>
+      </w:pPr>
+    </w:lvl>
+    <w:lvl w:ilvl="5">
+      <w:start w:val="1"/>
+      <w:numFmt w:val="none"/>
+      <w:suff w:val="nothing"/>
+      <w:lvlText w:val=""/>
+      <w:lvlJc w:val="start"/>
+      <w:pPr>
+        <w:tabs>
+          <w:tab w:val="num" w:pos="0"/>
+        </w:tabs>
+        <w:ind w:start="0" w:hanging="0"/>
+      </w:pPr>
+    </w:lvl>
+    <w:lvl w:ilvl="6">
+      <w:start w:val="1"/>
+      <w:numFmt w:val="none"/>
+      <w:suff w:val="nothing"/>
+      <w:lvlText w:val=""/>
+      <w:lvlJc w:val="start"/>
+      <w:pPr>
+        <w:tabs>
+          <w:tab w:val="num" w:pos="0"/>
+        </w:tabs>
+        <w:ind w:start="0" w:hanging="0"/>
+      </w:pPr>
+    </w:lvl>
+    <w:lvl w:ilvl="7">
+      <w:start w:val="1"/>
+      <w:numFmt w:val="none"/>
+      <w:suff w:val="nothing"/>
+      <w:lvlText w:val=""/>
+      <w:lvlJc w:val="start"/>
+      <w:pPr>
+        <w:tabs>
+          <w:tab w:val="num" w:pos="0"/>
+        </w:tabs>
+        <w:ind w:start="0" w:hanging="0"/>
+      </w:pPr>
+    </w:lvl>
+    <w:lvl w:ilvl="8">
+      <w:start w:val="1"/>
+      <w:numFmt w:val="none"/>
+      <w:suff w:val="nothing"/>
+      <w:lvlText w:val=""/>
+      <w:lvlJc w:val="start"/>
+      <w:pPr>
+        <w:tabs>
+          <w:tab w:val="num" w:pos="0"/>
+        </w:tabs>
+        <w:ind w:start="0" w:hanging="0"/>
+      </w:pPr>
+    </w:lvl>
+  </w:abstractNum>
+  <w:num w:numId="1">
+    <w:abstractNumId w:val="1"/>
+  </w:num>
+</w:numbering>
 </file>
 
 <file path=word/styles.xml><?xml version="1.0" encoding="utf-8"?>
@@ -124,7 +297,6 @@
     </w:rPrDefault>
     <w:pPrDefault>
       <w:pPr>
-        <w:widowControl/>
         <w:suppressAutoHyphens w:val="true"/>
       </w:pPr>
     </w:pPrDefault>
@@ -134,7 +306,10 @@
     <w:qFormat/>
     <w:pPr>
       <w:widowControl/>
+      <w:suppressAutoHyphens w:val="true"/>
       <w:bidi w:val="0"/>
+      <w:spacing w:before="0" w:after="0"/>
+      <w:jc w:val="start"/>
     </w:pPr>
     <w:rPr>
       <w:rFonts w:ascii="Liberation Serif" w:hAnsi="Liberation Serif" w:eastAsia="Noto Serif CJK SC" w:cs="Noto Sans Devanagari"/>
@@ -143,6 +318,26 @@
       <w:sz w:val="24"/>
       <w:szCs w:val="24"/>
       <w:lang w:val="en-US" w:eastAsia="zh-CN" w:bidi="hi-IN"/>
+    </w:rPr>
+  </w:style>
+  <w:style w:type="paragraph" w:styleId="Heading2">
+    <w:name w:val="Heading 2"/>
+    <w:basedOn w:val="Heading"/>
+    <w:next w:val="BodyText"/>
+    <w:qFormat/>
+    <w:pPr>
+      <w:numPr>
+        <w:ilvl w:val="1"/>
+        <w:numId w:val="1"/>
+      </w:numPr>
+      <w:spacing w:before="200" w:after="120"/>
+      <w:outlineLvl w:val="1"/>
+    </w:pPr>
+    <w:rPr>
+      <w:b/>
+      <w:bCs/>
+      <w:sz w:val="32"/>
+      <w:szCs w:val="32"/>
     </w:rPr>
   </w:style>
   <w:style w:type="paragraph" w:styleId="Heading">

</xml_diff>